<commit_message>
feat: regenerate chapter 3 json and log based on modified word files
</commit_message>
<xml_diff>
--- a/第三章/第三章(112.1開始增加).docx
+++ b/第三章/第三章(112.1開始增加).docx
@@ -11402,14 +11402,7 @@
         <w:t>號</w:t>
       </w:r>
     </w:p>
-    <w:p>
-      <w:r>
-        <w:rPr>
-          <w:rFonts w:hint="eastAsia"/>
-        </w:rPr>
-        <w:t>附件</w:t>
-      </w:r>
-    </w:p>
+    <w:p/>
     <w:p>
       <w:r>
         <w:rPr>

</xml_diff>